<commit_message>
Enforce complete justified text and table alignment across DOCX and PDF reports
</commit_message>
<xml_diff>
--- a/AkshadMakhana_ProjectReport.docx
+++ b/AkshadMakhana_ProjectReport.docx
@@ -108,6 +108,7 @@
           <w:p>
             <w:pPr>
               <w:spacing w:after="40" w:before="40"/>
+              <w:jc w:val="both"/>
             </w:pPr>
             <w:r>
               <w:rPr>
@@ -132,6 +133,7 @@
           <w:p>
             <w:pPr>
               <w:spacing w:after="40" w:before="40"/>
+              <w:jc w:val="both"/>
             </w:pPr>
             <w:r>
               <w:rPr>
@@ -158,6 +160,7 @@
           <w:p>
             <w:pPr>
               <w:spacing w:after="40" w:before="40"/>
+              <w:jc w:val="both"/>
             </w:pPr>
             <w:r>
               <w:rPr>
@@ -182,6 +185,7 @@
           <w:p>
             <w:pPr>
               <w:spacing w:after="40" w:before="40"/>
+              <w:jc w:val="both"/>
             </w:pPr>
             <w:r>
               <w:rPr>
@@ -208,6 +212,7 @@
           <w:p>
             <w:pPr>
               <w:spacing w:after="40" w:before="40"/>
+              <w:jc w:val="both"/>
             </w:pPr>
             <w:r>
               <w:rPr>
@@ -232,6 +237,7 @@
           <w:p>
             <w:pPr>
               <w:spacing w:after="40" w:before="40"/>
+              <w:jc w:val="both"/>
             </w:pPr>
             <w:r>
               <w:rPr>
@@ -258,6 +264,7 @@
           <w:p>
             <w:pPr>
               <w:spacing w:after="40" w:before="40"/>
+              <w:jc w:val="both"/>
             </w:pPr>
             <w:r>
               <w:rPr>
@@ -282,6 +289,7 @@
           <w:p>
             <w:pPr>
               <w:spacing w:after="40" w:before="40"/>
+              <w:jc w:val="both"/>
             </w:pPr>
             <w:r>
               <w:rPr>
@@ -308,6 +316,7 @@
           <w:p>
             <w:pPr>
               <w:spacing w:after="40" w:before="40"/>
+              <w:jc w:val="both"/>
             </w:pPr>
             <w:r>
               <w:rPr>
@@ -332,6 +341,7 @@
           <w:p>
             <w:pPr>
               <w:spacing w:after="40" w:before="40"/>
+              <w:jc w:val="both"/>
             </w:pPr>
             <w:r>
               <w:rPr>
@@ -358,6 +368,7 @@
           <w:p>
             <w:pPr>
               <w:spacing w:after="40" w:before="40"/>
+              <w:jc w:val="both"/>
             </w:pPr>
             <w:r>
               <w:rPr>
@@ -382,6 +393,7 @@
           <w:p>
             <w:pPr>
               <w:spacing w:after="40" w:before="40"/>
+              <w:jc w:val="both"/>
             </w:pPr>
             <w:r>
               <w:rPr>
@@ -408,6 +420,7 @@
           <w:p>
             <w:pPr>
               <w:spacing w:after="40" w:before="40"/>
+              <w:jc w:val="both"/>
             </w:pPr>
             <w:r>
               <w:rPr>
@@ -432,6 +445,7 @@
           <w:p>
             <w:pPr>
               <w:spacing w:after="40" w:before="40"/>
+              <w:jc w:val="both"/>
             </w:pPr>
             <w:r>
               <w:rPr>
@@ -458,6 +472,7 @@
           <w:p>
             <w:pPr>
               <w:spacing w:after="40" w:before="40"/>
+              <w:jc w:val="both"/>
             </w:pPr>
             <w:r>
               <w:rPr>
@@ -482,6 +497,7 @@
           <w:p>
             <w:pPr>
               <w:spacing w:after="40" w:before="40"/>
+              <w:jc w:val="both"/>
             </w:pPr>
             <w:r>
               <w:rPr>
@@ -509,6 +525,7 @@
           <w:p>
             <w:pPr>
               <w:spacing w:after="40" w:before="40"/>
+              <w:jc w:val="both"/>
             </w:pPr>
             <w:r>
               <w:rPr>
@@ -533,6 +550,7 @@
           <w:p>
             <w:pPr>
               <w:spacing w:after="40" w:before="40"/>
+              <w:jc w:val="both"/>
             </w:pPr>
             <w:r>
               <w:rPr>
@@ -560,6 +578,7 @@
           <w:p>
             <w:pPr>
               <w:spacing w:after="40" w:before="40"/>
+              <w:jc w:val="both"/>
             </w:pPr>
             <w:r>
               <w:rPr>
@@ -584,6 +603,7 @@
           <w:p>
             <w:pPr>
               <w:spacing w:after="40" w:before="40"/>
+              <w:jc w:val="both"/>
             </w:pPr>
             <w:r>
               <w:rPr>
@@ -597,6 +617,9 @@
       </w:tr>
     </w:tbl>
     <w:p>
+      <w:pPr>
+        <w:jc w:val="both"/>
+      </w:pPr>
       <w:r>
         <w:br w:type="page"/>
       </w:r>
@@ -605,7 +628,7 @@
       <w:pPr>
         <w:keepNext/>
         <w:spacing w:before="280" w:after="120"/>
-        <w:jc w:val="left"/>
+        <w:jc w:val="both"/>
       </w:pPr>
       <w:r>
         <w:rPr>
@@ -653,7 +676,7 @@
       <w:pPr>
         <w:keepNext/>
         <w:spacing w:before="200" w:after="80"/>
-        <w:jc w:val="left"/>
+        <w:jc w:val="both"/>
       </w:pPr>
       <w:r>
         <w:rPr>
@@ -790,7 +813,7 @@
       <w:pPr>
         <w:keepNext/>
         <w:spacing w:before="280" w:after="120"/>
-        <w:jc w:val="left"/>
+        <w:jc w:val="both"/>
       </w:pPr>
       <w:r>
         <w:rPr>
@@ -822,7 +845,7 @@
       <w:pPr>
         <w:keepNext/>
         <w:spacing w:before="200" w:after="80"/>
-        <w:jc w:val="left"/>
+        <w:jc w:val="both"/>
       </w:pPr>
       <w:r>
         <w:rPr>
@@ -877,6 +900,7 @@
           <w:p>
             <w:pPr>
               <w:spacing w:after="60" w:before="60"/>
+              <w:jc w:val="both"/>
             </w:pPr>
             <w:r>
               <w:rPr>
@@ -900,6 +924,7 @@
           <w:p>
             <w:pPr>
               <w:spacing w:after="60" w:before="60"/>
+              <w:jc w:val="both"/>
             </w:pPr>
             <w:r>
               <w:rPr>
@@ -923,6 +948,7 @@
           <w:p>
             <w:pPr>
               <w:spacing w:after="60" w:before="60"/>
+              <w:jc w:val="both"/>
             </w:pPr>
             <w:r>
               <w:rPr>
@@ -946,6 +972,7 @@
           <w:p>
             <w:pPr>
               <w:spacing w:after="60" w:before="60"/>
+              <w:jc w:val="both"/>
             </w:pPr>
             <w:r>
               <w:rPr>
@@ -970,6 +997,7 @@
           <w:p>
             <w:pPr>
               <w:spacing w:after="40" w:before="40"/>
+              <w:jc w:val="both"/>
             </w:pPr>
             <w:r>
               <w:rPr>
@@ -992,6 +1020,7 @@
           <w:p>
             <w:pPr>
               <w:spacing w:after="40" w:before="40"/>
+              <w:jc w:val="both"/>
             </w:pPr>
             <w:r>
               <w:rPr>
@@ -1013,6 +1042,7 @@
           <w:p>
             <w:pPr>
               <w:spacing w:after="40" w:before="40"/>
+              <w:jc w:val="both"/>
             </w:pPr>
             <w:r>
               <w:rPr>
@@ -1034,6 +1064,7 @@
           <w:p>
             <w:pPr>
               <w:spacing w:after="40" w:before="40"/>
+              <w:jc w:val="both"/>
             </w:pPr>
             <w:r>
               <w:rPr>
@@ -1057,6 +1088,7 @@
           <w:p>
             <w:pPr>
               <w:spacing w:after="40" w:before="40"/>
+              <w:jc w:val="both"/>
             </w:pPr>
             <w:r>
               <w:rPr>
@@ -1079,6 +1111,7 @@
           <w:p>
             <w:pPr>
               <w:spacing w:after="40" w:before="40"/>
+              <w:jc w:val="both"/>
             </w:pPr>
             <w:r>
               <w:rPr>
@@ -1100,6 +1133,7 @@
           <w:p>
             <w:pPr>
               <w:spacing w:after="40" w:before="40"/>
+              <w:jc w:val="both"/>
             </w:pPr>
             <w:r>
               <w:rPr>
@@ -1121,6 +1155,7 @@
           <w:p>
             <w:pPr>
               <w:spacing w:after="40" w:before="40"/>
+              <w:jc w:val="both"/>
             </w:pPr>
             <w:r>
               <w:rPr>
@@ -1144,6 +1179,7 @@
           <w:p>
             <w:pPr>
               <w:spacing w:after="40" w:before="40"/>
+              <w:jc w:val="both"/>
             </w:pPr>
             <w:r>
               <w:rPr>
@@ -1166,6 +1202,7 @@
           <w:p>
             <w:pPr>
               <w:spacing w:after="40" w:before="40"/>
+              <w:jc w:val="both"/>
             </w:pPr>
             <w:r>
               <w:rPr>
@@ -1187,6 +1224,7 @@
           <w:p>
             <w:pPr>
               <w:spacing w:after="40" w:before="40"/>
+              <w:jc w:val="both"/>
             </w:pPr>
             <w:r>
               <w:rPr>
@@ -1208,6 +1246,7 @@
           <w:p>
             <w:pPr>
               <w:spacing w:after="40" w:before="40"/>
+              <w:jc w:val="both"/>
             </w:pPr>
             <w:r>
               <w:rPr>
@@ -1231,6 +1270,7 @@
           <w:p>
             <w:pPr>
               <w:spacing w:after="40" w:before="40"/>
+              <w:jc w:val="both"/>
             </w:pPr>
             <w:r>
               <w:rPr>
@@ -1253,6 +1293,7 @@
           <w:p>
             <w:pPr>
               <w:spacing w:after="40" w:before="40"/>
+              <w:jc w:val="both"/>
             </w:pPr>
             <w:r>
               <w:rPr>
@@ -1274,6 +1315,7 @@
           <w:p>
             <w:pPr>
               <w:spacing w:after="40" w:before="40"/>
+              <w:jc w:val="both"/>
             </w:pPr>
             <w:r>
               <w:rPr>
@@ -1295,6 +1337,7 @@
           <w:p>
             <w:pPr>
               <w:spacing w:after="40" w:before="40"/>
+              <w:jc w:val="both"/>
             </w:pPr>
             <w:r>
               <w:rPr>
@@ -1318,6 +1361,7 @@
           <w:p>
             <w:pPr>
               <w:spacing w:after="40" w:before="40"/>
+              <w:jc w:val="both"/>
             </w:pPr>
             <w:r>
               <w:rPr>
@@ -1340,6 +1384,7 @@
           <w:p>
             <w:pPr>
               <w:spacing w:after="40" w:before="40"/>
+              <w:jc w:val="both"/>
             </w:pPr>
             <w:r>
               <w:rPr>
@@ -1361,6 +1406,7 @@
           <w:p>
             <w:pPr>
               <w:spacing w:after="40" w:before="40"/>
+              <w:jc w:val="both"/>
             </w:pPr>
             <w:r>
               <w:rPr>
@@ -1382,6 +1428,7 @@
           <w:p>
             <w:pPr>
               <w:spacing w:after="40" w:before="40"/>
+              <w:jc w:val="both"/>
             </w:pPr>
             <w:r>
               <w:rPr>
@@ -1413,7 +1460,7 @@
       <w:pPr>
         <w:keepNext/>
         <w:spacing w:before="160" w:after="80"/>
-        <w:jc w:val="center"/>
+        <w:jc w:val="both"/>
       </w:pPr>
       <w:r>
         <w:drawing>
@@ -1469,7 +1516,7 @@
       <w:pPr>
         <w:keepNext/>
         <w:spacing w:before="160" w:after="80"/>
-        <w:jc w:val="center"/>
+        <w:jc w:val="both"/>
       </w:pPr>
       <w:r>
         <w:drawing>
@@ -1525,7 +1572,7 @@
       <w:pPr>
         <w:keepNext/>
         <w:spacing w:before="280" w:after="120"/>
-        <w:jc w:val="left"/>
+        <w:jc w:val="both"/>
       </w:pPr>
       <w:r>
         <w:rPr>
@@ -1557,7 +1604,7 @@
       <w:pPr>
         <w:keepNext/>
         <w:spacing w:before="200" w:after="80"/>
-        <w:jc w:val="left"/>
+        <w:jc w:val="both"/>
       </w:pPr>
       <w:r>
         <w:rPr>
@@ -1670,7 +1717,7 @@
       <w:pPr>
         <w:keepNext/>
         <w:spacing w:before="160" w:after="80"/>
-        <w:jc w:val="center"/>
+        <w:jc w:val="both"/>
       </w:pPr>
       <w:r>
         <w:drawing>
@@ -1726,7 +1773,7 @@
       <w:pPr>
         <w:keepNext/>
         <w:spacing w:before="160" w:after="80"/>
-        <w:jc w:val="center"/>
+        <w:jc w:val="both"/>
       </w:pPr>
       <w:r>
         <w:drawing>
@@ -1782,7 +1829,7 @@
       <w:pPr>
         <w:keepNext/>
         <w:spacing w:before="280" w:after="120"/>
-        <w:jc w:val="left"/>
+        <w:jc w:val="both"/>
       </w:pPr>
       <w:r>
         <w:rPr>
@@ -1814,7 +1861,7 @@
       <w:pPr>
         <w:keepNext/>
         <w:spacing w:before="200" w:after="80"/>
-        <w:jc w:val="left"/>
+        <w:jc w:val="both"/>
       </w:pPr>
       <w:r>
         <w:rPr>
@@ -1853,6 +1900,7 @@
           <w:p>
             <w:pPr>
               <w:spacing w:after="60" w:before="60"/>
+              <w:jc w:val="both"/>
             </w:pPr>
             <w:r>
               <w:rPr>
@@ -1876,6 +1924,7 @@
           <w:p>
             <w:pPr>
               <w:spacing w:after="60" w:before="60"/>
+              <w:jc w:val="both"/>
             </w:pPr>
             <w:r>
               <w:rPr>
@@ -1899,6 +1948,7 @@
           <w:p>
             <w:pPr>
               <w:spacing w:after="60" w:before="60"/>
+              <w:jc w:val="both"/>
             </w:pPr>
             <w:r>
               <w:rPr>
@@ -1922,6 +1972,7 @@
           <w:p>
             <w:pPr>
               <w:spacing w:after="60" w:before="60"/>
+              <w:jc w:val="both"/>
             </w:pPr>
             <w:r>
               <w:rPr>
@@ -1946,6 +1997,7 @@
           <w:p>
             <w:pPr>
               <w:spacing w:after="40" w:before="40"/>
+              <w:jc w:val="both"/>
             </w:pPr>
             <w:r>
               <w:rPr>
@@ -1968,6 +2020,7 @@
           <w:p>
             <w:pPr>
               <w:spacing w:after="40" w:before="40"/>
+              <w:jc w:val="both"/>
             </w:pPr>
             <w:r>
               <w:rPr>
@@ -1989,6 +2042,7 @@
           <w:p>
             <w:pPr>
               <w:spacing w:after="40" w:before="40"/>
+              <w:jc w:val="both"/>
             </w:pPr>
             <w:r>
               <w:rPr>
@@ -2010,6 +2064,7 @@
           <w:p>
             <w:pPr>
               <w:spacing w:after="40" w:before="40"/>
+              <w:jc w:val="both"/>
             </w:pPr>
             <w:r>
               <w:rPr>
@@ -2033,6 +2088,7 @@
           <w:p>
             <w:pPr>
               <w:spacing w:after="40" w:before="40"/>
+              <w:jc w:val="both"/>
             </w:pPr>
             <w:r>
               <w:rPr>
@@ -2055,6 +2111,7 @@
           <w:p>
             <w:pPr>
               <w:spacing w:after="40" w:before="40"/>
+              <w:jc w:val="both"/>
             </w:pPr>
             <w:r>
               <w:rPr>
@@ -2076,6 +2133,7 @@
           <w:p>
             <w:pPr>
               <w:spacing w:after="40" w:before="40"/>
+              <w:jc w:val="both"/>
             </w:pPr>
             <w:r>
               <w:rPr>
@@ -2097,6 +2155,7 @@
           <w:p>
             <w:pPr>
               <w:spacing w:after="40" w:before="40"/>
+              <w:jc w:val="both"/>
             </w:pPr>
             <w:r>
               <w:rPr>
@@ -2120,6 +2179,7 @@
           <w:p>
             <w:pPr>
               <w:spacing w:after="40" w:before="40"/>
+              <w:jc w:val="both"/>
             </w:pPr>
             <w:r>
               <w:rPr>
@@ -2142,6 +2202,7 @@
           <w:p>
             <w:pPr>
               <w:spacing w:after="40" w:before="40"/>
+              <w:jc w:val="both"/>
             </w:pPr>
             <w:r>
               <w:rPr>
@@ -2163,6 +2224,7 @@
           <w:p>
             <w:pPr>
               <w:spacing w:after="40" w:before="40"/>
+              <w:jc w:val="both"/>
             </w:pPr>
             <w:r>
               <w:rPr>
@@ -2184,6 +2246,7 @@
           <w:p>
             <w:pPr>
               <w:spacing w:after="40" w:before="40"/>
+              <w:jc w:val="both"/>
             </w:pPr>
             <w:r>
               <w:rPr>
@@ -2207,6 +2270,7 @@
           <w:p>
             <w:pPr>
               <w:spacing w:after="40" w:before="40"/>
+              <w:jc w:val="both"/>
             </w:pPr>
             <w:r>
               <w:rPr>
@@ -2229,6 +2293,7 @@
           <w:p>
             <w:pPr>
               <w:spacing w:after="40" w:before="40"/>
+              <w:jc w:val="both"/>
             </w:pPr>
             <w:r>
               <w:rPr>
@@ -2250,6 +2315,7 @@
           <w:p>
             <w:pPr>
               <w:spacing w:after="40" w:before="40"/>
+              <w:jc w:val="both"/>
             </w:pPr>
             <w:r>
               <w:rPr>
@@ -2271,6 +2337,7 @@
           <w:p>
             <w:pPr>
               <w:spacing w:after="40" w:before="40"/>
+              <w:jc w:val="both"/>
             </w:pPr>
             <w:r>
               <w:rPr>
@@ -2294,6 +2361,7 @@
           <w:p>
             <w:pPr>
               <w:spacing w:after="40" w:before="40"/>
+              <w:jc w:val="both"/>
             </w:pPr>
             <w:r>
               <w:rPr>
@@ -2316,6 +2384,7 @@
           <w:p>
             <w:pPr>
               <w:spacing w:after="40" w:before="40"/>
+              <w:jc w:val="both"/>
             </w:pPr>
             <w:r>
               <w:rPr>
@@ -2337,6 +2406,7 @@
           <w:p>
             <w:pPr>
               <w:spacing w:after="40" w:before="40"/>
+              <w:jc w:val="both"/>
             </w:pPr>
             <w:r>
               <w:rPr>
@@ -2358,6 +2428,7 @@
           <w:p>
             <w:pPr>
               <w:spacing w:after="40" w:before="40"/>
+              <w:jc w:val="both"/>
             </w:pPr>
             <w:r>
               <w:rPr>
@@ -2389,7 +2460,7 @@
       <w:pPr>
         <w:keepNext/>
         <w:spacing w:before="160" w:after="80"/>
-        <w:jc w:val="center"/>
+        <w:jc w:val="both"/>
       </w:pPr>
       <w:r>
         <w:drawing>
@@ -2445,7 +2516,7 @@
       <w:pPr>
         <w:keepNext/>
         <w:spacing w:before="160" w:after="80"/>
-        <w:jc w:val="center"/>
+        <w:jc w:val="both"/>
       </w:pPr>
       <w:r>
         <w:drawing>
@@ -2501,7 +2572,7 @@
       <w:pPr>
         <w:keepNext/>
         <w:spacing w:before="280" w:after="120"/>
-        <w:jc w:val="left"/>
+        <w:jc w:val="both"/>
       </w:pPr>
       <w:r>
         <w:rPr>
@@ -2557,6 +2628,7 @@
           <w:p>
             <w:pPr>
               <w:spacing w:after="60" w:before="60"/>
+              <w:jc w:val="both"/>
             </w:pPr>
             <w:r>
               <w:rPr>
@@ -2580,6 +2652,7 @@
           <w:p>
             <w:pPr>
               <w:spacing w:after="60" w:before="60"/>
+              <w:jc w:val="both"/>
             </w:pPr>
             <w:r>
               <w:rPr>
@@ -2603,6 +2676,7 @@
           <w:p>
             <w:pPr>
               <w:spacing w:after="60" w:before="60"/>
+              <w:jc w:val="both"/>
             </w:pPr>
             <w:r>
               <w:rPr>
@@ -2626,6 +2700,7 @@
           <w:p>
             <w:pPr>
               <w:spacing w:after="60" w:before="60"/>
+              <w:jc w:val="both"/>
             </w:pPr>
             <w:r>
               <w:rPr>
@@ -2649,6 +2724,7 @@
           <w:p>
             <w:pPr>
               <w:spacing w:after="60" w:before="60"/>
+              <w:jc w:val="both"/>
             </w:pPr>
             <w:r>
               <w:rPr>
@@ -2672,6 +2748,7 @@
           <w:p>
             <w:pPr>
               <w:spacing w:after="60" w:before="60"/>
+              <w:jc w:val="both"/>
             </w:pPr>
             <w:r>
               <w:rPr>
@@ -2696,6 +2773,7 @@
           <w:p>
             <w:pPr>
               <w:spacing w:after="40" w:before="40"/>
+              <w:jc w:val="both"/>
             </w:pPr>
             <w:r>
               <w:rPr>
@@ -2718,6 +2796,7 @@
           <w:p>
             <w:pPr>
               <w:spacing w:after="40" w:before="40"/>
+              <w:jc w:val="both"/>
             </w:pPr>
             <w:r>
               <w:rPr>
@@ -2739,6 +2818,7 @@
           <w:p>
             <w:pPr>
               <w:spacing w:after="40" w:before="40"/>
+              <w:jc w:val="both"/>
             </w:pPr>
             <w:r>
               <w:rPr>
@@ -2760,6 +2840,7 @@
           <w:p>
             <w:pPr>
               <w:spacing w:after="40" w:before="40"/>
+              <w:jc w:val="both"/>
             </w:pPr>
             <w:r>
               <w:rPr>
@@ -2781,6 +2862,7 @@
           <w:p>
             <w:pPr>
               <w:spacing w:after="40" w:before="40"/>
+              <w:jc w:val="both"/>
             </w:pPr>
             <w:r>
               <w:rPr>
@@ -2802,6 +2884,7 @@
           <w:p>
             <w:pPr>
               <w:spacing w:after="40" w:before="40"/>
+              <w:jc w:val="both"/>
             </w:pPr>
             <w:r>
               <w:rPr>
@@ -2825,6 +2908,7 @@
           <w:p>
             <w:pPr>
               <w:spacing w:after="40" w:before="40"/>
+              <w:jc w:val="both"/>
             </w:pPr>
             <w:r>
               <w:rPr>
@@ -2847,6 +2931,7 @@
           <w:p>
             <w:pPr>
               <w:spacing w:after="40" w:before="40"/>
+              <w:jc w:val="both"/>
             </w:pPr>
             <w:r>
               <w:rPr>
@@ -2868,6 +2953,7 @@
           <w:p>
             <w:pPr>
               <w:spacing w:after="40" w:before="40"/>
+              <w:jc w:val="both"/>
             </w:pPr>
             <w:r>
               <w:rPr>
@@ -2889,6 +2975,7 @@
           <w:p>
             <w:pPr>
               <w:spacing w:after="40" w:before="40"/>
+              <w:jc w:val="both"/>
             </w:pPr>
             <w:r>
               <w:rPr>
@@ -2910,6 +2997,7 @@
           <w:p>
             <w:pPr>
               <w:spacing w:after="40" w:before="40"/>
+              <w:jc w:val="both"/>
             </w:pPr>
             <w:r>
               <w:rPr>
@@ -2931,6 +3019,7 @@
           <w:p>
             <w:pPr>
               <w:spacing w:after="40" w:before="40"/>
+              <w:jc w:val="both"/>
             </w:pPr>
             <w:r>
               <w:rPr>
@@ -2954,6 +3043,7 @@
           <w:p>
             <w:pPr>
               <w:spacing w:after="40" w:before="40"/>
+              <w:jc w:val="both"/>
             </w:pPr>
             <w:r>
               <w:rPr>
@@ -2976,6 +3066,7 @@
           <w:p>
             <w:pPr>
               <w:spacing w:after="40" w:before="40"/>
+              <w:jc w:val="both"/>
             </w:pPr>
             <w:r>
               <w:rPr>
@@ -2997,6 +3088,7 @@
           <w:p>
             <w:pPr>
               <w:spacing w:after="40" w:before="40"/>
+              <w:jc w:val="both"/>
             </w:pPr>
             <w:r>
               <w:rPr>
@@ -3018,6 +3110,7 @@
           <w:p>
             <w:pPr>
               <w:spacing w:after="40" w:before="40"/>
+              <w:jc w:val="both"/>
             </w:pPr>
             <w:r>
               <w:rPr>
@@ -3039,6 +3132,7 @@
           <w:p>
             <w:pPr>
               <w:spacing w:after="40" w:before="40"/>
+              <w:jc w:val="both"/>
             </w:pPr>
             <w:r>
               <w:rPr>
@@ -3060,6 +3154,7 @@
           <w:p>
             <w:pPr>
               <w:spacing w:after="40" w:before="40"/>
+              <w:jc w:val="both"/>
             </w:pPr>
             <w:r>
               <w:rPr>
@@ -3107,7 +3202,7 @@
       <w:pPr>
         <w:keepNext/>
         <w:spacing w:before="160" w:after="80"/>
-        <w:jc w:val="center"/>
+        <w:jc w:val="both"/>
       </w:pPr>
       <w:r>
         <w:drawing>
@@ -3163,7 +3258,7 @@
       <w:pPr>
         <w:keepNext/>
         <w:spacing w:before="160" w:after="80"/>
-        <w:jc w:val="center"/>
+        <w:jc w:val="both"/>
       </w:pPr>
       <w:r>
         <w:drawing>
@@ -3219,7 +3314,7 @@
       <w:pPr>
         <w:keepNext/>
         <w:spacing w:before="280" w:after="120"/>
-        <w:jc w:val="left"/>
+        <w:jc w:val="both"/>
       </w:pPr>
       <w:r>
         <w:rPr>
@@ -3251,7 +3346,7 @@
       <w:pPr>
         <w:keepNext/>
         <w:spacing w:before="200" w:after="80"/>
-        <w:jc w:val="left"/>
+        <w:jc w:val="both"/>
       </w:pPr>
       <w:r>
         <w:rPr>
@@ -3364,7 +3459,7 @@
       <w:pPr>
         <w:keepNext/>
         <w:spacing w:before="200" w:after="80"/>
-        <w:jc w:val="left"/>
+        <w:jc w:val="both"/>
       </w:pPr>
       <w:r>
         <w:rPr>
@@ -3397,7 +3492,7 @@
       <w:pPr>
         <w:keepNext/>
         <w:spacing w:before="160" w:after="80"/>
-        <w:jc w:val="center"/>
+        <w:jc w:val="both"/>
       </w:pPr>
       <w:r>
         <w:drawing>
@@ -3453,7 +3548,7 @@
       <w:pPr>
         <w:keepNext/>
         <w:spacing w:before="160" w:after="80"/>
-        <w:jc w:val="center"/>
+        <w:jc w:val="both"/>
       </w:pPr>
       <w:r>
         <w:drawing>
@@ -3509,7 +3604,7 @@
       <w:pPr>
         <w:keepNext/>
         <w:spacing w:before="280" w:after="120"/>
-        <w:jc w:val="left"/>
+        <w:jc w:val="both"/>
       </w:pPr>
       <w:r>
         <w:rPr>
@@ -3538,6 +3633,9 @@
       </w:r>
     </w:p>
     <w:p>
+      <w:pPr>
+        <w:jc w:val="both"/>
+      </w:pPr>
       <w:r>
         <w:br w:type="page"/>
       </w:r>
@@ -3546,7 +3644,7 @@
       <w:pPr>
         <w:keepNext/>
         <w:spacing w:before="280" w:after="120"/>
-        <w:jc w:val="left"/>
+        <w:jc w:val="both"/>
       </w:pPr>
       <w:r>
         <w:rPr>
@@ -3708,6 +3806,9 @@
             </w:tcBorders>
           </w:tcPr>
           <w:p>
+            <w:pPr>
+              <w:jc w:val="both"/>
+            </w:pPr>
             <w:r>
               <w:rPr>
                 <w:rFonts w:ascii="Times New Roman" w:hAnsi="Times New Roman"/>
@@ -3734,6 +3835,9 @@
             </w:tcBorders>
           </w:tcPr>
           <w:p>
+            <w:pPr>
+              <w:jc w:val="both"/>
+            </w:pPr>
             <w:r>
               <w:rPr>
                 <w:rFonts w:ascii="Times New Roman" w:hAnsi="Times New Roman"/>
@@ -3761,7 +3865,11 @@
               <w:right w:sz="0" w:val="none" w:color="FFFFFF"/>
             </w:tcBorders>
           </w:tcPr>
-          <w:p/>
+          <w:p>
+            <w:pPr>
+              <w:jc w:val="both"/>
+            </w:pPr>
+          </w:p>
         </w:tc>
         <w:tc>
           <w:tcPr>
@@ -3773,7 +3881,11 @@
               <w:right w:sz="0" w:val="none" w:color="FFFFFF"/>
             </w:tcBorders>
           </w:tcPr>
-          <w:p/>
+          <w:p>
+            <w:pPr>
+              <w:jc w:val="both"/>
+            </w:pPr>
+          </w:p>
         </w:tc>
       </w:tr>
     </w:tbl>
@@ -4190,6 +4302,9 @@
     <w:name w:val="Normal"/>
     <w:qFormat/>
     <w:rsid w:val="00FC693F"/>
+    <w:pPr>
+      <w:jc w:val="both"/>
+    </w:pPr>
     <w:rPr>
       <w:rFonts w:ascii="Times New Roman" w:hAnsi="Times New Roman"/>
       <w:color w:val="000000"/>

</xml_diff>